<commit_message>
Deliverables: drop Google Drive; output Word/.txt/.md + Excel as attachments
Per founder request — Google Drive needs too many permissions. Deliverables are
now delivered purely as local files attached in chat:
- Concept Dossier / Scorecard: .docx + .txt + .md (PDF is now opt-in via --pdf).
- Master comparison sheet / scoreboard: .xlsx (+ .csv).

Changes:
- scripts/build_deliverables.py: PDF off by default (--pdf to enable); always
  emit .md alongside .txt/.docx; add CSV -> formatted .xlsx (openpyxl) for the
  scoreboard.
- Remove all Google Drive upload steps and .pdf-as-required-format language from
  CLAUDE.md, 07, 09-12, and 14; require delivery as attachments instead.
- Regenerate the sample summary (no PDF) and add a labeled EXAMPLE scoreboard
  (.csv/.xlsx) demonstrating the Excel output.

https://claude.ai/code/session_011if97s7ZUzsoff4nB6Yfmu
</commit_message>
<xml_diff>
--- a/deliverables/2026-06-15-framework-update-summary.docx
+++ b/deliverables/2026-06-15-framework-update-summary.docx
@@ -546,29 +546,34 @@
         <w:rPr>
           <w:b/>
         </w:rPr>
-        <w:t>Word (.docx), PDF, and text (.txt)</w:t>
+        <w:t>Word (.docx), text (.txt), and Markdown (.md)</w:t>
       </w:r>
       <w:r>
-        <w:t xml:space="preserve"> files, saved in the</w:t>
+        <w:t xml:space="preserve"> files — and</w:t>
       </w:r>
     </w:p>
     <w:p>
       <w:r>
-        <w:t xml:space="preserve">project, </w:t>
+        <w:t xml:space="preserve">the scoreboard as an </w:t>
       </w:r>
       <w:r>
         <w:rPr>
           <w:b/>
         </w:rPr>
-        <w:t>pushed to your Google Drive</w:t>
+        <w:t>Excel (.xlsx)</w:t>
       </w:r>
       <w:r>
-        <w:t>, and sent to you as attachments — no GitHub</w:t>
+        <w:t xml:space="preserve"> file — saved in the project and **sent to you</w:t>
       </w:r>
     </w:p>
     <w:p>
       <w:r>
-        <w:t>required. (This very document was produced by that new pipeline as a test.)</w:t>
+        <w:t>directly as attachments** (no Google Drive, no GitHub digging). (This very document</w:t>
+      </w:r>
+    </w:p>
+    <w:p>
+      <w:r>
+        <w:t>was produced by that pipeline as a test.)</w:t>
       </w:r>
     </w:p>
     <w:p>
@@ -719,7 +724,7 @@
     </w:p>
     <w:p>
       <w:r>
-        <w:t>hand you plain-English dossiers for the top 2–3 in your Google Drive. Then take those</w:t>
+        <w:t>hand you plain-English dossiers for the top 2–3 as attachments. Then take those</w:t>
       </w:r>
     </w:p>
     <w:p>

</xml_diff>